<commit_message>
barlow/finesst: fill RRS from CV + finalize FI Current & Pending
- Research Readiness Statement: filled from the FI's CV (name, UH program, PI
  Glennie, current STV/SAR DEM research + Appalachian pipeline, skills, degrees).
  Condensed to hold the 1-page limit. 2 brackets left (transcript courses, exam date).
- Current & Pending: tuition ~$3,852/sem (TX-resident Eng-PhD, AY2027) + stipend;
  12-month assistantship to 08/2029; 6 person-months to FINESST with reallocation
  overlap statement; POP 01/2027-12/2029.
- Flag two timing constraints in README: FINESST start window (Jan-Jul 2027) and the
  3-year-award vs 08/2029-graduation mismatch.

Co-Authored-By: Claude Opus 4.8 (1M context) <noreply@anthropic.com>
</commit_message>
<xml_diff>
--- a/barlow/docs/current_pending_FI_goodrich.docx
+++ b/barlow/docs/current_pending_FI_goodrich.docx
@@ -131,7 +131,7 @@
         <w:t xml:space="preserve">Title: </w:t>
       </w:r>
       <w:r>
-        <w:t>Graduate Research/Teaching Assistantship — stipend and tuition waiver</w:t>
+        <w:t>Graduate assistantship — monthly stipend and tuition waiver</w:t>
       </w:r>
     </w:p>
     <w:p>
@@ -159,10 +159,13 @@
         <w:t xml:space="preserve">Award Number (if available): </w:t>
       </w:r>
       <w:r>
+        <w:t>N/A</w:t>
+      </w:r>
+      <w:r>
         <w:rPr>
           <w:color w:val="B03030"/>
         </w:rPr>
-        <w:t>[N/A or department/grant number]</w:t>
+        <w:t xml:space="preserve"> [or the department/grant number funding the stipend]</w:t>
       </w:r>
     </w:p>
     <w:p>
@@ -176,10 +179,13 @@
         <w:t xml:space="preserve">Source of Support: </w:t>
       </w:r>
       <w:r>
+        <w:t>University of Houston, Cullen College of Engineering</w:t>
+      </w:r>
+      <w:r>
         <w:rPr>
           <w:color w:val="B03030"/>
         </w:rPr>
-        <w:t>University of Houston [confirm: department, or the specific grant/fellowship funding the stipend]</w:t>
+        <w:t xml:space="preserve"> [confirm: department funds vs. a specific research grant]</w:t>
       </w:r>
     </w:p>
     <w:p>
@@ -207,10 +213,7 @@
         <w:t xml:space="preserve">Start Date: </w:t>
       </w:r>
       <w:r>
-        <w:rPr>
-          <w:color w:val="B03030"/>
-        </w:rPr>
-        <w:t>08/2025    End Date: [confirm — current academic appointment end, e.g., 05/2026 or ongoing]</w:t>
+        <w:t>08/2025    End Date: 08/2029 (12-month appointment, continuing to expected graduation)</w:t>
       </w:r>
     </w:p>
     <w:p>
@@ -224,21 +227,13 @@
         <w:t xml:space="preserve">Total Anticipated Amount: </w:t>
       </w:r>
       <w:r>
-        <w:rPr>
-          <w:color w:val="B03030"/>
-        </w:rPr>
-      </w:r>
-      <w:r>
-        <w:rPr>
-          <w:b w:val="0"/>
-        </w:rPr>
-        <w:t xml:space="preserve">Stipend $2,601.67/month (≈ $31,220/year at 12 months) + tuition waiver </w:t>
+        <w:t>Stipend $2,601.67/month (~$31,220/year, 12-month appointment) + tuition waiver ~$3,852/semester (~$7,700/year; TX-resident Engineering-PhD rate, 9 SCH, AY2027; mandatory fees additional)</w:t>
       </w:r>
       <w:r>
         <w:rPr>
           <w:color w:val="B03030"/>
         </w:rPr>
-        <w:t>[confirm tuition-waiver dollar value and appointment length]</w:t>
+        <w:t xml:space="preserve"> [confirm residency status + fee amounts]</w:t>
       </w:r>
     </w:p>
     <w:p>
@@ -252,10 +247,7 @@
         <w:t xml:space="preserve">Person-Months Per Year: </w:t>
       </w:r>
       <w:r>
-        <w:rPr>
-          <w:color w:val="B03030"/>
-        </w:rPr>
-        <w:t>[confirm — e.g., 9 academic-year months]</w:t>
+        <w:t>12 (12-month appointment; would reduce to ~6 if FINESST is awarded — see Overlap)</w:t>
       </w:r>
     </w:p>
     <w:p>
@@ -269,7 +261,7 @@
         <w:t xml:space="preserve">Overall Objectives: </w:t>
       </w:r>
       <w:r>
-        <w:t>Graduate assistantship supporting the FI's general doctoral study and training in geosensing/remote sensing; not tied to a single research project.</w:t>
+        <w:t>Graduate assistantship supporting the FI's doctoral study, training, and dissertation research in geosensing/remote sensing; not tied to a single external project.</w:t>
       </w:r>
     </w:p>
     <w:p>
@@ -283,7 +275,7 @@
         <w:t xml:space="preserve">Statement of Potential Overlap: </w:t>
       </w:r>
       <w:r>
-        <w:t>No scientific overlap with the pending FINESST proposal (Entry 2). If FINESST is awarded, the FI's support would transition to the FINESST budget for the proposed research; the institution will ensure the FI is not doubly compensated for the same effort, so total committed person-months remain ≤ 12 per year.</w:t>
+        <w:t>No scientific overlap with the pending FINESST proposal (Entry 2). If FINESST is awarded, 6 person-months/year now covered by this assistantship would be reallocated to FINESST for the proposed research; the assistantship adjusts accordingly, so the FI's total committed effort stays at 12 person-months/year with no double compensation.</w:t>
       </w:r>
     </w:p>
     <w:p>
@@ -380,10 +372,13 @@
         <w:t xml:space="preserve">Start Date: </w:t>
       </w:r>
       <w:r>
+        <w:t>01/2027    End Date: 12/2029 (3 years)</w:t>
+      </w:r>
+      <w:r>
         <w:rPr>
           <w:color w:val="B03030"/>
         </w:rPr>
-        <w:t>01/2027    End Date: 12/2029  [confirm requested period of performance]</w:t>
+        <w:t xml:space="preserve"> [FINESST start must fall Jan–Jul 2027; Aug 2026 is not allowed. Confirm final dates.]</w:t>
       </w:r>
     </w:p>
     <w:p>
@@ -397,10 +392,7 @@
         <w:t xml:space="preserve">Total Anticipated Amount: </w:t>
       </w:r>
       <w:r>
-        <w:rPr>
-          <w:color w:val="B03030"/>
-        </w:rPr>
-        <w:t>up to $150,000 ($50,000 per budget year × 3 years) [confirm requested total]</w:t>
+        <w:t>up to $150,000 ($50,000 per budget year × 3 years)</w:t>
       </w:r>
     </w:p>
     <w:p>
@@ -414,10 +406,7 @@
         <w:t xml:space="preserve">Person-Months Per Year: </w:t>
       </w:r>
       <w:r>
-        <w:rPr>
-          <w:color w:val="B03030"/>
-        </w:rPr>
-        <w:t>[confirm effort devoted to this project, e.g., 9 academic + 3 summer months]</w:t>
+        <w:t>6</w:t>
       </w:r>
     </w:p>
     <w:p>
@@ -431,7 +420,7 @@
         <w:t xml:space="preserve">Overall Objectives: </w:t>
       </w:r>
       <w:r>
-        <w:t>Attribute two decades of measured stream-channel and valley-floor geomorphic change in the McMurdo Dry Valleys to climate drivers, using multi-epoch lidar and satellite DEM differencing with per-pixel calibrated uncertainty.</w:t>
+        <w:t>Attribute two decades of measured stream-channel and valley-floor geomorphic change in the McMurdo Dry Valleys to climate drivers, using multi-epoch lidar and satellite-DEM differencing with per-pixel calibrated uncertainty.</w:t>
       </w:r>
     </w:p>
     <w:p>
@@ -445,7 +434,7 @@
         <w:t xml:space="preserve">Statement of Potential Overlap: </w:t>
       </w:r>
       <w:r>
-        <w:t>This is the proposal under consideration. No scientific overlap with current support; see Entry 1 for how any budgetary/effort overlap with the assistantship would be resolved if awarded.</w:t>
+        <w:t>This is the proposal under consideration. No scientific overlap with current support; any budgetary/effort overlap with the assistantship (Entry 1) is resolved by reallocation so total committed effort remains ≤ 12 person-months/year.</w:t>
       </w:r>
     </w:p>
     <w:p>

</xml_diff>